<commit_message>
Removed discussions; Mostly accessibility fixed
</commit_message>
<xml_diff>
--- a/assets/lecture-related/unit-01/01-unit-worksheet-01.docx
+++ b/assets/lecture-related/unit-01/01-unit-worksheet-01.docx
@@ -919,7 +919,6 @@
         <w:ind/>
         <w:rPr/>
       </w:pPr>
-      <w:r/>
       <w:r/>
       <w:r/>
     </w:p>
@@ -2562,15 +2561,7 @@
         <w:t xml:space="preserve"> incorrect</w:t>
       </w:r>
       <w:r/>
-    </w:p>
-    <w:p>
-      <w:pPr>
-        <w:suppressLineNumbers w:val="true"/>
-        <w:pBdr/>
-        <w:spacing/>
-        <w:ind/>
-        <w:rPr/>
-      </w:pPr>
+      <w:r/>
       <w:r/>
       <w:r/>
     </w:p>

</xml_diff>